<commit_message>
Refresh final advanced module 1 output
</commit_message>
<xml_diff>
--- a/adv/md/final/modules/aw-adv_mod1_n10_demoted_fixed.docx
+++ b/adv/md/final/modules/aw-adv_mod1_n10_demoted_fixed.docx
@@ -38,10 +38,7 @@
         <w:pStyle w:val="BodyText"/>
       </w:pPr>
       <w:r>
-        <w:t>The three units address three interconnected dimensions of professional administrative writing. Unit 1 examines how sentence structure affects the reader’s ability to process information, moving beyond length as a measure of clarity to focus on the logical relationships between ideas. Unit 2 addresses the register choices that shape how a message is received — the ability to calibrate tone precisely for different audiences and relationships. Unit 3 brings these skills together at the paragraph level, develo</w:t>
-      </w:r>
-      <w:r>
-        <w:t>ping the use of cohesive devices and logical sequencing to build texts that are not just grammatically correct but genuinely easy to follow.</w:t>
+        <w:t>The three units address three interconnected dimensions of professional administrative writing. Unit 1 examines how sentence structure affects the reader’s ability to process information, moving beyond length as a measure of clarity to focus on the logical relationships between ideas. Unit 2 addresses the register choices that shape how a message is received — the ability to calibrate tone precisely for different audiences and relationships. Unit 3 brings these skills together at the paragraph level, developing the use of cohesive devices and logical sequencing to build texts that are not just grammatically correct but genuinely easy to follow.</w:t>
       </w:r>
     </w:p>
     <w:p>
@@ -56,8 +53,8 @@
       <w:pPr>
         <w:pStyle w:val="Heading3"/>
       </w:pPr>
-      <w:bookmarkStart w:id="2" w:name="unit-1-controlling-sentence-complexity"/>
-      <w:bookmarkStart w:id="3" w:name="unit-overview"/>
+      <w:bookmarkStart w:id="2" w:name="unit-overview"/>
+      <w:bookmarkStart w:id="3" w:name="unit-1-controlling-sentence-complexity"/>
       <w:bookmarkEnd w:id="0"/>
       <w:bookmarkEnd w:id="1"/>
     </w:p>
@@ -102,6 +99,7 @@
               <w:pStyle w:val="UnitNumber"/>
             </w:pPr>
             <w:r>
+              <w:lastRenderedPageBreak/>
               <w:t>U1</w:t>
             </w:r>
           </w:p>
@@ -193,7 +191,7 @@
         <w:pStyle w:val="Heading3"/>
       </w:pPr>
       <w:bookmarkStart w:id="4" w:name="a.-opening-activation"/>
-      <w:bookmarkEnd w:id="3"/>
+      <w:bookmarkEnd w:id="2"/>
       <w:r>
         <w:t>A. Opening &amp; Activation</w:t>
       </w:r>
@@ -225,7 +223,6 @@
           <w:i/>
           <w:iCs/>
         </w:rPr>
-        <w:lastRenderedPageBreak/>
         <w:t>We confirmed the applicant submitted updated documents that were incomplete because the translation team had not finished their review although they intended to submit a draft earlier which caused delays.</w:t>
       </w:r>
     </w:p>
@@ -262,6 +259,9 @@
       </w:r>
     </w:p>
     <w:p>
+      <w:pPr>
+        <w:pStyle w:val="AfterList"/>
+      </w:pPr>
       <w:r>
         <w:t>For each sentence, identify:</w:t>
       </w:r>
@@ -355,13 +355,14 @@
         <w:pStyle w:val="BlockTextBad"/>
       </w:pPr>
       <w:r>
-        <w:t>“Because we were unable to verify the applicant’s supporting documents during the initial review, and since the translation submitted last week contained several inconsistencies that require clarification, we will need to request an updated version; however, before doing so, we must confirm internally whether the missing information is essential for the current stage of examination. Additionally, the team noted that some details may have been omitted unintentionally, which could affect the accuracy of furth</w:t>
-      </w:r>
-      <w:r>
-        <w:t>er processing if not corrected promptly.”</w:t>
-      </w:r>
-    </w:p>
-    <w:p>
+        <w:lastRenderedPageBreak/>
+        <w:t>“Because we were unable to verify the applicant’s supporting documents during the initial review, and since the translation submitted last week contained several inconsistencies that require clarification, we will need to request an updated version; however, before doing so, we must confirm internally whether the missing information is essential for the current stage of examination. Additionally, the team noted that some details may have been omitted unintentionally, which could affect the accuracy of further processing if not corrected promptly.”</w:t>
+      </w:r>
+    </w:p>
+    <w:p>
+      <w:pPr>
+        <w:spacing w:before="200"/>
+      </w:pPr>
       <w:r>
         <w:rPr>
           <w:b/>
@@ -375,7 +376,13 @@
         <w:pStyle w:val="BlockTextGood"/>
       </w:pPr>
       <w:r>
-        <w:t>“We were unable to verify the applicant’s supporting documents during the initial review. The translation submitted last week contained several inconsistencies that require clarification, so we will request an updated version. Before doing so, we will confirm internally whether the missing information is essential at this stage. The team has also noted that some details may have been omitted unintentionally; if left uncorrected, this could affect the accuracy of further processing.”</w:t>
+        <w:t xml:space="preserve">“We were unable to verify the applicant’s supporting documents during the initial review. The translation submitted last week contained several inconsistencies that require clarification, so we will request an updated version. Before doing so, we will </w:t>
+      </w:r>
+      <w:r>
+        <w:t>confirm internally whether the missing information is essential at this stage. The</w:t>
+      </w:r>
+      <w:r>
+        <w:t xml:space="preserve"> team has also noted that some details may have been omitted unintentionally; if left uncorrected, this could affect the accuracy of further processing.”</w:t>
       </w:r>
     </w:p>
     <w:p>
@@ -452,7 +459,13 @@
         <w:t>Why this works:</w:t>
       </w:r>
       <w:r>
-        <w:t xml:space="preserve"> The revised version is clearer not because every sentence is short, but because each sentence has one main communicative job. Verification, action, internal checking, and possible consequence are separated into stages, so the reader does not have to process several competing relationships at once.</w:t>
+        <w:t xml:space="preserve"> The revised version is clearer not because every sentence is short, but because each sentence has one </w:t>
+      </w:r>
+      <w:r>
+        <w:t>main</w:t>
+      </w:r>
+      <w:r>
+        <w:t xml:space="preserve"> communicative job. Verification, action, internal checking, and possible consequence are separated into stages, so the reader does not have to process several competing relationships at once.</w:t>
       </w:r>
     </w:p>
     <w:p>
@@ -511,10 +524,7 @@
         <w:t>coordination</w:t>
       </w:r>
       <w:r>
-        <w:t xml:space="preserve"> </w:t>
-      </w:r>
-      <w:r>
-        <w:t>(joining equal ideas)</w:t>
+        <w:t xml:space="preserve"> (joining equal ideas)</w:t>
       </w:r>
     </w:p>
     <w:p>
@@ -558,10 +568,7 @@
         <w:t>pair of sentences</w:t>
       </w:r>
       <w:r>
-        <w:t xml:space="preserve"> </w:t>
-      </w:r>
-      <w:r>
-        <w:t>where one idea has been segmented (split across two sentences) to reduce logical load</w:t>
+        <w:t xml:space="preserve"> where one idea has been segmented (split across two sentences) to reduce logical load</w:t>
       </w:r>
     </w:p>
     <w:p>
@@ -569,7 +576,13 @@
         <w:pStyle w:val="AfterList"/>
       </w:pPr>
       <w:r>
-        <w:t>Reflect: How do these features make the revised version easier to process?</w:t>
+        <w:t xml:space="preserve">Reflect: How do </w:t>
+      </w:r>
+      <w:r>
+        <w:t>these</w:t>
+      </w:r>
+      <w:r>
+        <w:t xml:space="preserve"> features make the revised version easier to process?</w:t>
       </w:r>
     </w:p>
     <w:p>
@@ -581,6 +594,7 @@
           <w:b/>
           <w:bCs/>
         </w:rPr>
+        <w:lastRenderedPageBreak/>
         <w:t>Teaching point:</w:t>
       </w:r>
       <w:r>
@@ -601,6 +615,7 @@
     <w:p>
       <w:pPr>
         <w:pStyle w:val="BlockText"/>
+        <w:ind w:left="227"/>
       </w:pPr>
       <w:r>
         <w:rPr>
@@ -809,97 +824,117 @@
     </w:p>
     <w:p>
       <w:pPr>
-        <w:pStyle w:val="AfterList"/>
+        <w:pStyle w:val="Heading5"/>
+      </w:pPr>
+      <w:r>
+        <w:t>Practice A — Add Coordinators (C2)</w:t>
+      </w:r>
+    </w:p>
+    <w:p>
+      <w:pPr>
+        <w:pStyle w:val="BodyText"/>
+      </w:pPr>
+      <w:r>
+        <w:t>Choose the most appropriate connector for each sentence.</w:t>
+      </w:r>
+    </w:p>
+    <w:p>
+      <w:pPr>
+        <w:pStyle w:val="ListNumber2"/>
+        <w:numPr>
+          <w:ilvl w:val="0"/>
+          <w:numId w:val="14"/>
+        </w:numPr>
+      </w:pPr>
+      <w:r>
+        <w:t>We need to confirm the applicant’s address, ___ we must also check the original application form.</w:t>
+      </w:r>
+    </w:p>
+    <w:p>
+      <w:pPr>
+        <w:pStyle w:val="ListNumber2"/>
+        <w:numPr>
+          <w:ilvl w:val="0"/>
+          <w:numId w:val="14"/>
+        </w:numPr>
+      </w:pPr>
+      <w:r>
+        <w:t>The team attempted to submit the report, ___ the system outage prevented completion.</w:t>
+      </w:r>
+    </w:p>
+    <w:p>
+      <w:pPr>
+        <w:pStyle w:val="ListNumber2"/>
+        <w:numPr>
+          <w:ilvl w:val="0"/>
+          <w:numId w:val="14"/>
+        </w:numPr>
+      </w:pPr>
+      <w:r>
+        <w:t>The deadline is approaching, ___ we appreciate your prompt cooperation.</w:t>
+      </w:r>
+    </w:p>
+    <w:p>
+      <w:pPr>
+        <w:pStyle w:val="ListNumber2"/>
+        <w:numPr>
+          <w:ilvl w:val="0"/>
+          <w:numId w:val="14"/>
+        </w:numPr>
+      </w:pPr>
+      <w:r>
+        <w:t>The office received two versions of the document, ___ it is unclear which one should be processed.</w:t>
+      </w:r>
+    </w:p>
+    <w:p>
+      <w:pPr>
+        <w:pStyle w:val="Heading4"/>
+      </w:pPr>
+      <w:bookmarkStart w:id="11" w:name="Xd2c441841628d649f743c2f840c17aeca6d04d8"/>
+      <w:bookmarkEnd w:id="10"/>
+      <w:r>
+        <w:t>2. Subordination (showing supporting or secondary ideas)</w:t>
+      </w:r>
+    </w:p>
+    <w:p>
+      <w:r>
+        <w:lastRenderedPageBreak/>
+        <w:t>Indicates relationship and hierarchy between ideas. The subordinate clause is less central than the main clause — it provides context, reason, time reference, or qualification.</w:t>
+      </w:r>
+    </w:p>
+    <w:p>
+      <w:pPr>
+        <w:pStyle w:val="BodyText"/>
       </w:pPr>
       <w:r>
         <w:rPr>
           <w:b/>
           <w:bCs/>
         </w:rPr>
-        <w:t>Practice A — Add Coordinators (C2)</w:t>
-      </w:r>
-    </w:p>
-    <w:p>
-      <w:pPr>
-        <w:pStyle w:val="BodyText"/>
-      </w:pPr>
-      <w:r>
-        <w:t>Choose the most appropriate connector for each sentence.</w:t>
-      </w:r>
-    </w:p>
-    <w:p>
-      <w:pPr>
-        <w:pStyle w:val="ListNumber2"/>
-        <w:numPr>
-          <w:ilvl w:val="0"/>
-          <w:numId w:val="14"/>
-        </w:numPr>
-      </w:pPr>
-      <w:r>
-        <w:t>We need to confirm the applicant’s address, ___ we must also check the original application form.</w:t>
-      </w:r>
-    </w:p>
-    <w:p>
-      <w:pPr>
-        <w:pStyle w:val="ListNumber2"/>
-        <w:numPr>
-          <w:ilvl w:val="0"/>
-          <w:numId w:val="14"/>
-        </w:numPr>
-      </w:pPr>
-      <w:r>
-        <w:t>The team attempted to submit the report, ___ the system outage prevented completion.</w:t>
-      </w:r>
-    </w:p>
-    <w:p>
-      <w:pPr>
-        <w:pStyle w:val="ListNumber2"/>
-        <w:numPr>
-          <w:ilvl w:val="0"/>
-          <w:numId w:val="14"/>
-        </w:numPr>
-      </w:pPr>
-      <w:r>
-        <w:t>The deadline is approaching, ___ we appreciate your prompt cooperation.</w:t>
-      </w:r>
-    </w:p>
-    <w:p>
-      <w:pPr>
-        <w:pStyle w:val="ListNumber2"/>
-        <w:numPr>
-          <w:ilvl w:val="0"/>
-          <w:numId w:val="14"/>
-        </w:numPr>
-      </w:pPr>
-      <w:r>
-        <w:t>The office received two versions of the document, ___ it is unclear which one should be processed.</w:t>
-      </w:r>
-    </w:p>
-    <w:p>
-      <w:pPr>
-        <w:pStyle w:val="Heading4"/>
-      </w:pPr>
-      <w:bookmarkStart w:id="11" w:name="Xd2c441841628d649f743c2f840c17aeca6d04d8"/>
-      <w:bookmarkEnd w:id="10"/>
-      <w:r>
-        <w:t>2. Subordination (showing supporting or secondary ideas)</w:t>
-      </w:r>
-    </w:p>
-    <w:p>
-      <w:r>
-        <w:t>Indicates relationship and hierarchy between ideas. The subordinate clause is less central than the main clause — it provides context, reason, time reference, or qualification.</w:t>
-      </w:r>
-    </w:p>
-    <w:p>
-      <w:pPr>
-        <w:pStyle w:val="BodyText"/>
+        <w:t>Common subordinators:</w:t>
+      </w:r>
+      <w:r>
+        <w:t xml:space="preserve"> </w:t>
+      </w:r>
+      <w:r>
+        <w:rPr>
+          <w:i/>
+          <w:iCs/>
+        </w:rPr>
+        <w:t>because, although, when, while, since, unless, even if, even though</w:t>
+      </w:r>
+    </w:p>
+    <w:p>
+      <w:pPr>
+        <w:pStyle w:val="BlockText"/>
+        <w:ind w:left="227"/>
       </w:pPr>
       <w:r>
         <w:rPr>
           <w:b/>
           <w:bCs/>
         </w:rPr>
-        <w:t>Common subordinators:</w:t>
+        <w:t>Note on contrast:</w:t>
       </w:r>
       <w:r>
         <w:t xml:space="preserve"> </w:t>
@@ -909,175 +944,149 @@
           <w:i/>
           <w:iCs/>
         </w:rPr>
-        <w:t>because, although, when, while, since, unless, even if, even though</w:t>
-      </w:r>
-    </w:p>
-    <w:p>
-      <w:pPr>
-        <w:pStyle w:val="BlockText"/>
-      </w:pPr>
+        <w:t>Although</w:t>
+      </w:r>
+      <w:r>
+        <w:t xml:space="preserve"> and </w:t>
+      </w:r>
+      <w:r>
+        <w:rPr>
+          <w:i/>
+          <w:iCs/>
+        </w:rPr>
+        <w:t>while</w:t>
+      </w:r>
+      <w:r>
+        <w:t xml:space="preserve"> express contrast subordinately — the contrasting idea is framed as background, not equal. Compare: </w:t>
+      </w:r>
+      <w:r>
+        <w:rPr>
+          <w:i/>
+          <w:iCs/>
+        </w:rPr>
+        <w:t>The guidelines were revised, but some teams continued using the previous version</w:t>
+      </w:r>
+      <w:r>
+        <w:t xml:space="preserve"> (equal contrast) vs. </w:t>
+      </w:r>
+      <w:r>
+        <w:rPr>
+          <w:i/>
+          <w:iCs/>
+        </w:rPr>
+        <w:t>Although the guidelines were revised, some teams continued using the previous version</w:t>
+      </w:r>
+      <w:r>
+        <w:t xml:space="preserve"> (revision is background; continued use is the main point).</w:t>
+      </w:r>
+    </w:p>
+    <w:p>
+      <w:pPr>
+        <w:pStyle w:val="Heading5"/>
+      </w:pPr>
+      <w:r>
+        <w:t>Practice B — Identify the Subordination Function (C2)</w:t>
+      </w:r>
+    </w:p>
+    <w:p>
+      <w:pPr>
+        <w:pStyle w:val="BodyText"/>
+      </w:pPr>
+      <w:r>
+        <w:t xml:space="preserve">State whether the subordinate clause expresses </w:t>
+      </w:r>
       <w:r>
         <w:rPr>
           <w:b/>
           <w:bCs/>
         </w:rPr>
-        <w:t>Note on contrast:</w:t>
-      </w:r>
-      <w:r>
-        <w:t xml:space="preserve"> </w:t>
-      </w:r>
+        <w:t>reason</w:t>
+      </w:r>
+      <w:r>
+        <w:t xml:space="preserve">, </w:t>
+      </w:r>
+      <w:r>
+        <w:rPr>
+          <w:b/>
+          <w:bCs/>
+        </w:rPr>
+        <w:t>contrast</w:t>
+      </w:r>
+      <w:r>
+        <w:t xml:space="preserve">, or </w:t>
+      </w:r>
+      <w:r>
+        <w:rPr>
+          <w:b/>
+          <w:bCs/>
+        </w:rPr>
+        <w:t>time</w:t>
+      </w:r>
+      <w:r>
+        <w:t>.</w:t>
+      </w:r>
+    </w:p>
+    <w:p>
+      <w:pPr>
+        <w:pStyle w:val="ListNumber2"/>
+        <w:numPr>
+          <w:ilvl w:val="0"/>
+          <w:numId w:val="15"/>
+        </w:numPr>
+      </w:pPr>
       <w:r>
         <w:rPr>
           <w:i/>
           <w:iCs/>
         </w:rPr>
-        <w:t>Although</w:t>
-      </w:r>
-      <w:r>
-        <w:t xml:space="preserve"> and </w:t>
-      </w:r>
+        <w:t>Because the file was corrupted, the attachments did not open.</w:t>
+      </w:r>
+    </w:p>
+    <w:p>
+      <w:pPr>
+        <w:pStyle w:val="ListNumber2"/>
+        <w:numPr>
+          <w:ilvl w:val="0"/>
+          <w:numId w:val="15"/>
+        </w:numPr>
+      </w:pPr>
       <w:r>
         <w:rPr>
           <w:i/>
           <w:iCs/>
         </w:rPr>
-        <w:t>while</w:t>
-      </w:r>
-      <w:r>
-        <w:t xml:space="preserve"> express contrast subordinately — the contrasting idea is framed as background, not equal. Compare: </w:t>
-      </w:r>
+        <w:t>While we understand the concern, the process cannot be changed at this stage.</w:t>
+      </w:r>
+    </w:p>
+    <w:p>
+      <w:pPr>
+        <w:pStyle w:val="ListNumber2"/>
+        <w:numPr>
+          <w:ilvl w:val="0"/>
+          <w:numId w:val="15"/>
+        </w:numPr>
+      </w:pPr>
       <w:r>
         <w:rPr>
           <w:i/>
           <w:iCs/>
         </w:rPr>
-        <w:t>The guidelines were revised, but some teams continued using the previous version</w:t>
-      </w:r>
-      <w:r>
-        <w:t xml:space="preserve"> (equal contrast) vs. </w:t>
-      </w:r>
+        <w:t>When the update is complete, the system will prompt users to log in again.</w:t>
+      </w:r>
+    </w:p>
+    <w:p>
+      <w:pPr>
+        <w:pStyle w:val="ListNumber2"/>
+        <w:numPr>
+          <w:ilvl w:val="0"/>
+          <w:numId w:val="15"/>
+        </w:numPr>
+      </w:pPr>
       <w:r>
         <w:rPr>
           <w:i/>
           <w:iCs/>
         </w:rPr>
-        <w:t>Although the guidelines were revised, some teams continued using the previous version</w:t>
-      </w:r>
-      <w:r>
-        <w:t xml:space="preserve"> (revision is background; continued use is the main point).</w:t>
-      </w:r>
-    </w:p>
-    <w:p>
-      <w:pPr>
-        <w:pStyle w:val="AfterList"/>
-      </w:pPr>
-      <w:r>
-        <w:rPr>
-          <w:b/>
-          <w:bCs/>
-        </w:rPr>
-        <w:t>Practice B — Identify the Subordination Function (C2)</w:t>
-      </w:r>
-    </w:p>
-    <w:p>
-      <w:pPr>
-        <w:pStyle w:val="BodyText"/>
-      </w:pPr>
-      <w:r>
-        <w:t xml:space="preserve">State whether the subordinate clause expresses </w:t>
-      </w:r>
-      <w:r>
-        <w:rPr>
-          <w:b/>
-          <w:bCs/>
-        </w:rPr>
-        <w:t>reason</w:t>
-      </w:r>
-      <w:r>
-        <w:t xml:space="preserve">, </w:t>
-      </w:r>
-      <w:r>
-        <w:rPr>
-          <w:b/>
-          <w:bCs/>
-        </w:rPr>
-        <w:t>contrast</w:t>
-      </w:r>
-      <w:r>
-        <w:t xml:space="preserve">, or </w:t>
-      </w:r>
-      <w:r>
-        <w:rPr>
-          <w:b/>
-          <w:bCs/>
-        </w:rPr>
-        <w:t>time</w:t>
-      </w:r>
-      <w:r>
-        <w:t>.</w:t>
-      </w:r>
-    </w:p>
-    <w:p>
-      <w:pPr>
-        <w:pStyle w:val="ListNumber2"/>
-        <w:numPr>
-          <w:ilvl w:val="0"/>
-          <w:numId w:val="15"/>
-        </w:numPr>
-      </w:pPr>
-      <w:r>
-        <w:rPr>
-          <w:i/>
-          <w:iCs/>
-        </w:rPr>
-        <w:t>Because the file was corrupted, the attachments did not open.</w:t>
-      </w:r>
-    </w:p>
-    <w:p>
-      <w:pPr>
-        <w:pStyle w:val="ListNumber2"/>
-        <w:numPr>
-          <w:ilvl w:val="0"/>
-          <w:numId w:val="15"/>
-        </w:numPr>
-      </w:pPr>
-      <w:r>
-        <w:rPr>
-          <w:i/>
-          <w:iCs/>
-        </w:rPr>
-        <w:t>While we understand the concern, the process cannot be changed at this stage.</w:t>
-      </w:r>
-    </w:p>
-    <w:p>
-      <w:pPr>
-        <w:pStyle w:val="ListNumber2"/>
-        <w:numPr>
-          <w:ilvl w:val="0"/>
-          <w:numId w:val="15"/>
-        </w:numPr>
-      </w:pPr>
-      <w:r>
-        <w:rPr>
-          <w:i/>
-          <w:iCs/>
-        </w:rPr>
-        <w:t>When the update is complete, the system will prompt users to log in again.</w:t>
-      </w:r>
-    </w:p>
-    <w:p>
-      <w:pPr>
-        <w:pStyle w:val="ListNumber2"/>
-        <w:numPr>
-          <w:ilvl w:val="0"/>
-          <w:numId w:val="15"/>
-        </w:numPr>
-      </w:pPr>
-      <w:r>
-        <w:rPr>
-          <w:i/>
-          <w:iCs/>
-        </w:rPr>
         <w:t>Although the instructions were revised, some teams continued using the previous version.</w:t>
       </w:r>
     </w:p>
@@ -1088,7 +1097,13 @@
       <w:bookmarkStart w:id="12" w:name="Xf328f2e15ecd1d8bdac6fd53848c7853a5e7578"/>
       <w:bookmarkEnd w:id="11"/>
       <w:r>
-        <w:t>3. Clarity Patterns for Administrative Writing (C3)</w:t>
+        <w:t xml:space="preserve">3. Clarity </w:t>
+      </w:r>
+      <w:r>
+        <w:t>Patterns</w:t>
+      </w:r>
+      <w:r>
+        <w:t xml:space="preserve"> for Administrative Writing (C3)</w:t>
       </w:r>
     </w:p>
     <w:p>
@@ -1096,7 +1111,16 @@
         <w:pStyle w:val="BlockText"/>
       </w:pPr>
       <w:r>
-        <w:t>The arrow (→) in each pattern label shows the order in which ideas are presented in the sentence.</w:t>
+        <w:t>The arrow (</w:t>
+      </w:r>
+      <w:r>
+        <w:rPr>
+          <w:rFonts w:ascii="Courier New" w:hAnsi="Courier New" w:cs="Courier New"/>
+        </w:rPr>
+        <w:t>→</w:t>
+      </w:r>
+      <w:r>
+        <w:t>) in each pattern label shows the order in which ideas are presented in the sentence.</w:t>
       </w:r>
     </w:p>
     <w:p>
@@ -1275,10 +1299,7 @@
         <w:pStyle w:val="AfterList"/>
       </w:pPr>
       <w:r>
-        <w:rPr>
-          <w:b/>
-          <w:bCs/>
-        </w:rPr>
+        <w:lastRenderedPageBreak/>
         <w:t>Example:</w:t>
       </w:r>
     </w:p>
@@ -1331,10 +1352,6 @@
         <w:pStyle w:val="AfterList"/>
       </w:pPr>
       <w:r>
-        <w:rPr>
-          <w:b/>
-          <w:bCs/>
-        </w:rPr>
         <w:t>Practice C — Apply the Patterns (C3)</w:t>
       </w:r>
     </w:p>
@@ -1607,7 +1624,11 @@
         <w:t>two or three related factors</w:t>
       </w:r>
       <w:r>
-        <w:t xml:space="preserve"> — for example, a problem and its cause, a decision and the reasons behind it, or a sequence of steps with a dependency between them. The situation should be complex enough that there is a genuine logical relationship to express.</w:t>
+        <w:t xml:space="preserve"> — for example, a problem and its cause, a decision and the reasons behind it, or a sequence of steps with </w:t>
+      </w:r>
+      <w:r>
+        <w:lastRenderedPageBreak/>
+        <w:t>a dependency between them. The situation should be complex enough that there is a genuine logical relationship to express.</w:t>
       </w:r>
     </w:p>
     <w:p>
@@ -1776,10 +1797,7 @@
         <w:t>150 words</w:t>
       </w:r>
       <w:r>
-        <w:t xml:space="preserve"> </w:t>
-      </w:r>
-      <w:r>
-        <w:t>explaining the cause of an administrative problem to an internal reader. Your explanation should:</w:t>
+        <w:t xml:space="preserve"> explaining the cause of an administrative problem to an internal reader. Your explanation should:</w:t>
       </w:r>
     </w:p>
     <w:p>
@@ -1887,6 +1905,7 @@
       <w:bookmarkEnd w:id="16"/>
       <w:bookmarkEnd w:id="17"/>
       <w:r>
+        <w:lastRenderedPageBreak/>
         <w:t>F. Review &amp; Self-Assessment</w:t>
       </w:r>
     </w:p>
@@ -2179,6 +2198,7 @@
         </w:numPr>
       </w:pPr>
       <w:r>
+        <w:lastRenderedPageBreak/>
         <w:t>A filing deadline was missed by your team. Several factors contributed, including a system issue, a staffing gap, and unclear instructions from a partner office. Write an explanation for your supervisor.</w:t>
       </w:r>
     </w:p>
@@ -2273,9 +2293,9 @@
       <w:pPr>
         <w:pStyle w:val="Heading3"/>
       </w:pPr>
-      <w:bookmarkStart w:id="25" w:name="X2a3b2393381a573bef40034eff9545472ca041b"/>
-      <w:bookmarkStart w:id="26" w:name="unit-overview-1"/>
-      <w:bookmarkEnd w:id="2"/>
+      <w:bookmarkStart w:id="25" w:name="unit-overview-1"/>
+      <w:bookmarkStart w:id="26" w:name="X2a3b2393381a573bef40034eff9545472ca041b"/>
+      <w:bookmarkEnd w:id="3"/>
       <w:bookmarkEnd w:id="22"/>
       <w:bookmarkEnd w:id="24"/>
     </w:p>
@@ -2320,6 +2340,7 @@
               <w:pStyle w:val="UnitNumber"/>
             </w:pPr>
             <w:r>
+              <w:lastRenderedPageBreak/>
               <w:t>U2</w:t>
             </w:r>
           </w:p>
@@ -2411,7 +2432,7 @@
         <w:pStyle w:val="Heading3"/>
       </w:pPr>
       <w:bookmarkStart w:id="27" w:name="a.-opening-activation-1"/>
-      <w:bookmarkEnd w:id="26"/>
+      <w:bookmarkEnd w:id="25"/>
       <w:r>
         <w:t>A. Opening &amp; Activation</w:t>
       </w:r>
@@ -2529,7 +2550,11 @@
         <w:pStyle w:val="BlockTextGood"/>
       </w:pPr>
       <w:r>
-        <w:t>“It appears that the submitted document may not match the version required for this stage. To ensure accuracy in our review, we would appreciate it if you could confirm whether an updated file is available. Once received, we will be able to proceed with the next steps of the examination.”</w:t>
+        <w:t xml:space="preserve">“It appears that the submitted document may not match the version required for this stage. To ensure accuracy in our review, we would appreciate it if you could confirm </w:t>
+      </w:r>
+      <w:r>
+        <w:lastRenderedPageBreak/>
+        <w:t>whether an updated file is available. Once received, we will be able to proceed with the next steps of the examination.”</w:t>
       </w:r>
     </w:p>
     <w:p>
@@ -2606,10 +2631,7 @@
         <w:t>Why this works:</w:t>
       </w:r>
       <w:r>
-        <w:t xml:space="preserve"> </w:t>
-      </w:r>
-      <w:r>
-        <w:t>The revised version protects the working relationship. It reduces blame, gives a professional reason for the request, and makes cooperation easier by showing what the reader can do next without feeling attacked.</w:t>
+        <w:t xml:space="preserve"> The revised version protects the working relationship. It reduces blame, gives a professional reason for the request, and makes cooperation easier by showing what the reader can do next without feeling attacked.</w:t>
       </w:r>
     </w:p>
     <w:p>
@@ -2912,6 +2934,7 @@
           <w:i/>
           <w:iCs/>
         </w:rPr>
+        <w:lastRenderedPageBreak/>
         <w:t>For our internal confirmation…</w:t>
       </w:r>
     </w:p>
@@ -2919,12 +2942,334 @@
       <w:pPr>
         <w:pStyle w:val="AfterList"/>
       </w:pPr>
+      <w:r>
+        <w:t>Practice A — Match the Function</w:t>
+      </w:r>
+    </w:p>
+    <w:p>
+      <w:pPr>
+        <w:pStyle w:val="BodyText"/>
+      </w:pPr>
+      <w:r>
+        <w:t>Match each softening phrase (A–D) to its function (1–4).</w:t>
+      </w:r>
+    </w:p>
+    <w:p>
+      <w:pPr>
+        <w:pStyle w:val="BodyText"/>
+      </w:pPr>
+      <w:r>
+        <w:t xml:space="preserve">A. </w:t>
+      </w:r>
+      <w:r>
+        <w:rPr>
+          <w:i/>
+          <w:iCs/>
+        </w:rPr>
+        <w:t>It appears that…</w:t>
+      </w:r>
+      <w:r>
+        <w:t xml:space="preserve"> B. </w:t>
+      </w:r>
+      <w:r>
+        <w:rPr>
+          <w:i/>
+          <w:iCs/>
+        </w:rPr>
+        <w:t>We would appreciate it if you could…</w:t>
+      </w:r>
+      <w:r>
+        <w:t xml:space="preserve"> C. </w:t>
+      </w:r>
+      <w:r>
+        <w:rPr>
+          <w:i/>
+          <w:iCs/>
+        </w:rPr>
+        <w:t>For our internal confirmation…</w:t>
+      </w:r>
+      <w:r>
+        <w:t xml:space="preserve"> D. </w:t>
+      </w:r>
+      <w:r>
+        <w:rPr>
+          <w:i/>
+          <w:iCs/>
+        </w:rPr>
+        <w:t>To ensure accuracy…</w:t>
+      </w:r>
+    </w:p>
+    <w:p>
+      <w:pPr>
+        <w:pStyle w:val="BodyText"/>
+      </w:pPr>
+      <w:r>
+        <w:t>Functions:</w:t>
+      </w:r>
+    </w:p>
+    <w:p>
+      <w:pPr>
+        <w:pStyle w:val="ListNumber2"/>
+        <w:numPr>
+          <w:ilvl w:val="0"/>
+          <w:numId w:val="36"/>
+        </w:numPr>
+      </w:pPr>
+      <w:r>
+        <w:t>providing a neutral justification</w:t>
+      </w:r>
+    </w:p>
+    <w:p>
+      <w:pPr>
+        <w:pStyle w:val="ListNumber2"/>
+        <w:numPr>
+          <w:ilvl w:val="0"/>
+          <w:numId w:val="36"/>
+        </w:numPr>
+      </w:pPr>
+      <w:r>
+        <w:t>making an indirect request</w:t>
+      </w:r>
+    </w:p>
+    <w:p>
+      <w:pPr>
+        <w:pStyle w:val="ListNumber2"/>
+        <w:numPr>
+          <w:ilvl w:val="0"/>
+          <w:numId w:val="36"/>
+        </w:numPr>
+      </w:pPr>
+      <w:r>
+        <w:t>introducing a possible issue without assigning blame</w:t>
+      </w:r>
+    </w:p>
+    <w:p>
+      <w:pPr>
+        <w:pStyle w:val="ListNumber2"/>
+        <w:numPr>
+          <w:ilvl w:val="0"/>
+          <w:numId w:val="36"/>
+        </w:numPr>
+      </w:pPr>
+      <w:r>
+        <w:t>clarifying the purpose or reason for a request</w:t>
+      </w:r>
+    </w:p>
+    <w:p>
+      <w:pPr>
+        <w:pStyle w:val="Heading4"/>
+      </w:pPr>
+      <w:bookmarkStart w:id="34" w:name="neutral-clarification-language-c3"/>
+      <w:bookmarkEnd w:id="33"/>
+      <w:r>
+        <w:t>2. Neutral Clarification Language (C3)</w:t>
+      </w:r>
+    </w:p>
+    <w:p>
+      <w:r>
+        <w:t>Used for gathering information without sounding accusatory.</w:t>
+      </w:r>
+    </w:p>
+    <w:p>
+      <w:pPr>
+        <w:pStyle w:val="BodyText"/>
+      </w:pPr>
+      <w:r>
+        <w:t>Neutral clarification language is useful when you need accurate information but do not want to imply fault before the facts are confirmed. The goal is to keep the question professional, answerable, and non-defensive.</w:t>
+      </w:r>
+    </w:p>
+    <w:p>
+      <w:pPr>
+        <w:pStyle w:val="AfterList"/>
+      </w:pPr>
+      <w:r>
+        <w:t>Examples:</w:t>
+      </w:r>
+    </w:p>
+    <w:p>
+      <w:pPr>
+        <w:pStyle w:val="ListBullet2"/>
+        <w:numPr>
+          <w:ilvl w:val="0"/>
+          <w:numId w:val="37"/>
+        </w:numPr>
+      </w:pPr>
+      <w:r>
+        <w:rPr>
+          <w:i/>
+          <w:iCs/>
+        </w:rPr>
+        <w:t>Could you clarify whether…</w:t>
+      </w:r>
+    </w:p>
+    <w:p>
+      <w:pPr>
+        <w:pStyle w:val="ListBullet2"/>
+        <w:numPr>
+          <w:ilvl w:val="0"/>
+          <w:numId w:val="37"/>
+        </w:numPr>
+      </w:pPr>
+      <w:r>
+        <w:rPr>
+          <w:i/>
+          <w:iCs/>
+        </w:rPr>
+        <w:t>We would like to confirm the status of…</w:t>
+      </w:r>
+    </w:p>
+    <w:p>
+      <w:pPr>
+        <w:pStyle w:val="ListBullet2"/>
+        <w:numPr>
+          <w:ilvl w:val="0"/>
+          <w:numId w:val="37"/>
+        </w:numPr>
+      </w:pPr>
+      <w:r>
+        <w:rPr>
+          <w:i/>
+          <w:iCs/>
+        </w:rPr>
+        <w:t>For consistency, may we ask if…</w:t>
+      </w:r>
+    </w:p>
+    <w:p>
+      <w:pPr>
+        <w:pStyle w:val="ListBullet2"/>
+        <w:numPr>
+          <w:ilvl w:val="0"/>
+          <w:numId w:val="37"/>
+        </w:numPr>
+      </w:pPr>
+      <w:r>
+        <w:rPr>
+          <w:i/>
+          <w:iCs/>
+        </w:rPr>
+        <w:t>If available, could you share…</w:t>
+      </w:r>
+    </w:p>
+    <w:p>
+      <w:pPr>
+        <w:pStyle w:val="AfterList"/>
+      </w:pPr>
+      <w:r>
+        <w:t>Practice B — Rewrite Direct Questions</w:t>
+      </w:r>
+    </w:p>
+    <w:p>
+      <w:pPr>
+        <w:pStyle w:val="BodyText"/>
+      </w:pPr>
+      <w:r>
+        <w:t>Rewrite each question using neutral clarification language.</w:t>
+      </w:r>
+    </w:p>
+    <w:p>
+      <w:pPr>
+        <w:pStyle w:val="ListNumber2"/>
+        <w:numPr>
+          <w:ilvl w:val="0"/>
+          <w:numId w:val="38"/>
+        </w:numPr>
+      </w:pPr>
+      <w:r>
+        <w:rPr>
+          <w:i/>
+          <w:iCs/>
+        </w:rPr>
+        <w:t>Why did you change the format?</w:t>
+      </w:r>
+    </w:p>
+    <w:p>
+      <w:pPr>
+        <w:pStyle w:val="ListNumber2"/>
+        <w:numPr>
+          <w:ilvl w:val="0"/>
+          <w:numId w:val="38"/>
+        </w:numPr>
+      </w:pPr>
+      <w:r>
+        <w:rPr>
+          <w:i/>
+          <w:iCs/>
+        </w:rPr>
+        <w:t>When will you finish the revision?</w:t>
+      </w:r>
+    </w:p>
+    <w:p>
+      <w:pPr>
+        <w:pStyle w:val="ListNumber2"/>
+        <w:numPr>
+          <w:ilvl w:val="0"/>
+          <w:numId w:val="38"/>
+        </w:numPr>
+      </w:pPr>
+      <w:r>
+        <w:rPr>
+          <w:i/>
+          <w:iCs/>
+        </w:rPr>
+        <w:t>Who made this decision?</w:t>
+      </w:r>
+    </w:p>
+    <w:p>
+      <w:pPr>
+        <w:pStyle w:val="ListNumber2"/>
+        <w:numPr>
+          <w:ilvl w:val="0"/>
+          <w:numId w:val="38"/>
+        </w:numPr>
+      </w:pPr>
+      <w:r>
+        <w:rPr>
+          <w:i/>
+          <w:iCs/>
+        </w:rPr>
+        <w:t>Did you read the previous instructions?</w:t>
+      </w:r>
+    </w:p>
+    <w:p>
+      <w:pPr>
+        <w:pStyle w:val="Heading4"/>
+      </w:pPr>
+      <w:bookmarkStart w:id="35" w:name="audience-appropriate-tone-c2"/>
+      <w:bookmarkEnd w:id="34"/>
+      <w:r>
+        <w:t>3. Audience-Appropriate Tone (C2)</w:t>
+      </w:r>
+    </w:p>
+    <w:p>
       <w:r>
         <w:rPr>
           <w:b/>
           <w:bCs/>
         </w:rPr>
-        <w:t>Practice A — Match the Function</w:t>
+        <w:t>Internal →</w:t>
+      </w:r>
+      <w:r>
+        <w:t xml:space="preserve"> can be slightly more direct </w:t>
+      </w:r>
+      <w:r>
+        <w:rPr>
+          <w:b/>
+          <w:bCs/>
+        </w:rPr>
+        <w:t>Interagency →</w:t>
+      </w:r>
+      <w:r>
+        <w:t xml:space="preserve"> requires neutrality and objectivity </w:t>
+      </w:r>
+      <w:r>
+        <w:rPr>
+          <w:b/>
+          <w:bCs/>
+        </w:rPr>
+        <w:t>International / foreign office →</w:t>
+      </w:r>
+      <w:r>
+        <w:t xml:space="preserve"> requires extra diplomacy and clarity</w:t>
       </w:r>
     </w:p>
     <w:p>
@@ -2932,131 +3277,74 @@
         <w:pStyle w:val="BodyText"/>
       </w:pPr>
       <w:r>
-        <w:t>Match each softening phrase (A–D) to its function (1–4).</w:t>
-      </w:r>
-    </w:p>
-    <w:p>
-      <w:pPr>
-        <w:pStyle w:val="BodyText"/>
-      </w:pPr>
-      <w:r>
-        <w:t xml:space="preserve">A. </w:t>
+        <w:rPr>
+          <w:b/>
+          <w:bCs/>
+        </w:rPr>
+        <w:t>Worked example:</w:t>
+      </w:r>
+    </w:p>
+    <w:p>
+      <w:pPr>
+        <w:pStyle w:val="ListBullet2"/>
+        <w:numPr>
+          <w:ilvl w:val="0"/>
+          <w:numId w:val="39"/>
+        </w:numPr>
+      </w:pPr>
+      <w:r>
+        <w:t xml:space="preserve">Internal: </w:t>
       </w:r>
       <w:r>
         <w:rPr>
           <w:i/>
           <w:iCs/>
         </w:rPr>
-        <w:t>It appears that…</w:t>
-      </w:r>
-      <w:r>
-        <w:t xml:space="preserve"> B. </w:t>
+        <w:t>Could you send the corrected file today?</w:t>
+      </w:r>
+    </w:p>
+    <w:p>
+      <w:pPr>
+        <w:pStyle w:val="ListBullet2"/>
+        <w:numPr>
+          <w:ilvl w:val="0"/>
+          <w:numId w:val="39"/>
+        </w:numPr>
+      </w:pPr>
+      <w:r>
+        <w:lastRenderedPageBreak/>
+        <w:t xml:space="preserve">Interagency: </w:t>
       </w:r>
       <w:r>
         <w:rPr>
           <w:i/>
           <w:iCs/>
         </w:rPr>
-        <w:t>We would appreciate it if you could…</w:t>
-      </w:r>
-      <w:r>
-        <w:t xml:space="preserve"> C. </w:t>
+        <w:t>Could you confirm whether an updated file is available for this case?</w:t>
+      </w:r>
+    </w:p>
+    <w:p>
+      <w:pPr>
+        <w:pStyle w:val="ListBullet2"/>
+        <w:numPr>
+          <w:ilvl w:val="0"/>
+          <w:numId w:val="39"/>
+        </w:numPr>
+      </w:pPr>
+      <w:r>
+        <w:t xml:space="preserve">Foreign office: </w:t>
       </w:r>
       <w:r>
         <w:rPr>
           <w:i/>
           <w:iCs/>
         </w:rPr>
-        <w:t>For our internal confirmation…</w:t>
-      </w:r>
-      <w:r>
-        <w:t xml:space="preserve"> D. </w:t>
-      </w:r>
-      <w:r>
-        <w:rPr>
-          <w:i/>
-          <w:iCs/>
-        </w:rPr>
-        <w:t>To ensure accuracy…</w:t>
-      </w:r>
-    </w:p>
-    <w:p>
-      <w:pPr>
-        <w:pStyle w:val="BodyText"/>
-      </w:pPr>
-      <w:r>
-        <w:t>Functions:</w:t>
-      </w:r>
-    </w:p>
-    <w:p>
-      <w:pPr>
-        <w:pStyle w:val="ListNumber2"/>
-        <w:numPr>
-          <w:ilvl w:val="0"/>
-          <w:numId w:val="36"/>
-        </w:numPr>
-      </w:pPr>
-      <w:r>
-        <w:t>providing a neutral justification</w:t>
-      </w:r>
-    </w:p>
-    <w:p>
-      <w:pPr>
-        <w:pStyle w:val="ListNumber2"/>
-        <w:numPr>
-          <w:ilvl w:val="0"/>
-          <w:numId w:val="36"/>
-        </w:numPr>
-      </w:pPr>
-      <w:r>
-        <w:t>making an indirect request</w:t>
-      </w:r>
-    </w:p>
-    <w:p>
-      <w:pPr>
-        <w:pStyle w:val="ListNumber2"/>
-        <w:numPr>
-          <w:ilvl w:val="0"/>
-          <w:numId w:val="36"/>
-        </w:numPr>
-      </w:pPr>
-      <w:r>
-        <w:t>introducing a possible issue without assigning blame</w:t>
-      </w:r>
-    </w:p>
-    <w:p>
-      <w:pPr>
-        <w:pStyle w:val="ListNumber2"/>
-        <w:numPr>
-          <w:ilvl w:val="0"/>
-          <w:numId w:val="36"/>
-        </w:numPr>
-      </w:pPr>
-      <w:r>
-        <w:t>clarifying the purpose or reason for a request</w:t>
-      </w:r>
-    </w:p>
-    <w:p>
-      <w:pPr>
-        <w:pStyle w:val="Heading4"/>
-      </w:pPr>
-      <w:bookmarkStart w:id="34" w:name="neutral-clarification-language-c3"/>
-      <w:bookmarkEnd w:id="33"/>
-      <w:r>
-        <w:t>2. Neutral Clarification Language (C3)</w:t>
-      </w:r>
-    </w:p>
-    <w:p>
-      <w:r>
-        <w:t>Used for gathering information without sounding accusatory.</w:t>
-      </w:r>
-    </w:p>
-    <w:p>
-      <w:pPr>
-        <w:pStyle w:val="BodyText"/>
-      </w:pPr>
-      <w:r>
-        <w:t>Neutral clarification language is useful when you need accurate information but do not want to imply fault before the facts are confirmed. The goal is to keep the question professional, answerable, and non-defensive.</w:t>
+        <w:t>We would appreciate it if you could confirm whether an updated file is available at your earliest convenience.</w:t>
+      </w:r>
+    </w:p>
+    <w:p>
+      <w:r>
+        <w:t>The core request stays the same, but the amount of softening and explicit reader support increases as the relationship becomes more formal or distant.</w:t>
       </w:r>
     </w:p>
     <w:p>
@@ -3064,289 +3352,6 @@
         <w:pStyle w:val="AfterList"/>
       </w:pPr>
       <w:r>
-        <w:rPr>
-          <w:b/>
-          <w:bCs/>
-        </w:rPr>
-        <w:t>Examples:</w:t>
-      </w:r>
-    </w:p>
-    <w:p>
-      <w:pPr>
-        <w:pStyle w:val="ListBullet2"/>
-        <w:numPr>
-          <w:ilvl w:val="0"/>
-          <w:numId w:val="37"/>
-        </w:numPr>
-      </w:pPr>
-      <w:r>
-        <w:rPr>
-          <w:i/>
-          <w:iCs/>
-        </w:rPr>
-        <w:t>Could you clarify whether…</w:t>
-      </w:r>
-    </w:p>
-    <w:p>
-      <w:pPr>
-        <w:pStyle w:val="ListBullet2"/>
-        <w:numPr>
-          <w:ilvl w:val="0"/>
-          <w:numId w:val="37"/>
-        </w:numPr>
-      </w:pPr>
-      <w:r>
-        <w:rPr>
-          <w:i/>
-          <w:iCs/>
-        </w:rPr>
-        <w:t>We would like to confirm the status of…</w:t>
-      </w:r>
-    </w:p>
-    <w:p>
-      <w:pPr>
-        <w:pStyle w:val="ListBullet2"/>
-        <w:numPr>
-          <w:ilvl w:val="0"/>
-          <w:numId w:val="37"/>
-        </w:numPr>
-      </w:pPr>
-      <w:r>
-        <w:rPr>
-          <w:i/>
-          <w:iCs/>
-        </w:rPr>
-        <w:t>For consistency, may we ask if…</w:t>
-      </w:r>
-    </w:p>
-    <w:p>
-      <w:pPr>
-        <w:pStyle w:val="ListBullet2"/>
-        <w:numPr>
-          <w:ilvl w:val="0"/>
-          <w:numId w:val="37"/>
-        </w:numPr>
-      </w:pPr>
-      <w:r>
-        <w:rPr>
-          <w:i/>
-          <w:iCs/>
-        </w:rPr>
-        <w:t>If available, could you share…</w:t>
-      </w:r>
-    </w:p>
-    <w:p>
-      <w:pPr>
-        <w:pStyle w:val="AfterList"/>
-      </w:pPr>
-      <w:r>
-        <w:rPr>
-          <w:b/>
-          <w:bCs/>
-        </w:rPr>
-        <w:t>Practice B — Rewrite Direct Questions</w:t>
-      </w:r>
-    </w:p>
-    <w:p>
-      <w:pPr>
-        <w:pStyle w:val="BodyText"/>
-      </w:pPr>
-      <w:r>
-        <w:t>Rewrite each question using neutral clarification language.</w:t>
-      </w:r>
-    </w:p>
-    <w:p>
-      <w:pPr>
-        <w:pStyle w:val="ListNumber2"/>
-        <w:numPr>
-          <w:ilvl w:val="0"/>
-          <w:numId w:val="38"/>
-        </w:numPr>
-      </w:pPr>
-      <w:r>
-        <w:rPr>
-          <w:i/>
-          <w:iCs/>
-        </w:rPr>
-        <w:t>Why did you change the format?</w:t>
-      </w:r>
-    </w:p>
-    <w:p>
-      <w:pPr>
-        <w:pStyle w:val="ListNumber2"/>
-        <w:numPr>
-          <w:ilvl w:val="0"/>
-          <w:numId w:val="38"/>
-        </w:numPr>
-      </w:pPr>
-      <w:r>
-        <w:rPr>
-          <w:i/>
-          <w:iCs/>
-        </w:rPr>
-        <w:t>When will you finish the revision?</w:t>
-      </w:r>
-    </w:p>
-    <w:p>
-      <w:pPr>
-        <w:pStyle w:val="ListNumber2"/>
-        <w:numPr>
-          <w:ilvl w:val="0"/>
-          <w:numId w:val="38"/>
-        </w:numPr>
-      </w:pPr>
-      <w:r>
-        <w:rPr>
-          <w:i/>
-          <w:iCs/>
-        </w:rPr>
-        <w:t>Who made this decision?</w:t>
-      </w:r>
-    </w:p>
-    <w:p>
-      <w:pPr>
-        <w:pStyle w:val="ListNumber2"/>
-        <w:numPr>
-          <w:ilvl w:val="0"/>
-          <w:numId w:val="38"/>
-        </w:numPr>
-      </w:pPr>
-      <w:r>
-        <w:rPr>
-          <w:i/>
-          <w:iCs/>
-        </w:rPr>
-        <w:t>Did you read the previous instructions?</w:t>
-      </w:r>
-    </w:p>
-    <w:p>
-      <w:pPr>
-        <w:pStyle w:val="Heading4"/>
-      </w:pPr>
-      <w:bookmarkStart w:id="35" w:name="audience-appropriate-tone-c2"/>
-      <w:bookmarkEnd w:id="34"/>
-      <w:r>
-        <w:t>3. Audience-Appropriate Tone (C2)</w:t>
-      </w:r>
-    </w:p>
-    <w:p>
-      <w:r>
-        <w:rPr>
-          <w:b/>
-          <w:bCs/>
-        </w:rPr>
-        <w:t>Internal →</w:t>
-      </w:r>
-      <w:r>
-        <w:t xml:space="preserve"> </w:t>
-      </w:r>
-      <w:r>
-        <w:t xml:space="preserve">can be slightly more direct </w:t>
-      </w:r>
-      <w:r>
-        <w:rPr>
-          <w:b/>
-          <w:bCs/>
-        </w:rPr>
-        <w:t>Interagency →</w:t>
-      </w:r>
-      <w:r>
-        <w:t xml:space="preserve"> requires neutrality and objectivity </w:t>
-      </w:r>
-      <w:r>
-        <w:rPr>
-          <w:b/>
-          <w:bCs/>
-        </w:rPr>
-        <w:t>International / foreign office →</w:t>
-      </w:r>
-      <w:r>
-        <w:t xml:space="preserve"> requires extra diplomacy and clarity</w:t>
-      </w:r>
-    </w:p>
-    <w:p>
-      <w:pPr>
-        <w:pStyle w:val="BodyText"/>
-      </w:pPr>
-      <w:r>
-        <w:rPr>
-          <w:b/>
-          <w:bCs/>
-        </w:rPr>
-        <w:t>Worked example:</w:t>
-      </w:r>
-    </w:p>
-    <w:p>
-      <w:pPr>
-        <w:pStyle w:val="ListBullet2"/>
-        <w:numPr>
-          <w:ilvl w:val="0"/>
-          <w:numId w:val="39"/>
-        </w:numPr>
-      </w:pPr>
-      <w:r>
-        <w:t xml:space="preserve">Internal: </w:t>
-      </w:r>
-      <w:r>
-        <w:rPr>
-          <w:i/>
-          <w:iCs/>
-        </w:rPr>
-        <w:t>Could you send the corrected file today?</w:t>
-      </w:r>
-    </w:p>
-    <w:p>
-      <w:pPr>
-        <w:pStyle w:val="ListBullet2"/>
-        <w:numPr>
-          <w:ilvl w:val="0"/>
-          <w:numId w:val="39"/>
-        </w:numPr>
-      </w:pPr>
-      <w:r>
-        <w:t xml:space="preserve">Interagency: </w:t>
-      </w:r>
-      <w:r>
-        <w:rPr>
-          <w:i/>
-          <w:iCs/>
-        </w:rPr>
-        <w:t>Could you confirm whether an updated file is available for this case?</w:t>
-      </w:r>
-    </w:p>
-    <w:p>
-      <w:pPr>
-        <w:pStyle w:val="ListBullet2"/>
-        <w:numPr>
-          <w:ilvl w:val="0"/>
-          <w:numId w:val="39"/>
-        </w:numPr>
-      </w:pPr>
-      <w:r>
-        <w:t xml:space="preserve">Foreign office: </w:t>
-      </w:r>
-      <w:r>
-        <w:rPr>
-          <w:i/>
-          <w:iCs/>
-        </w:rPr>
-        <w:t>We would appreciate it if you could confirm whether an updated file is available at your earliest convenience.</w:t>
-      </w:r>
-    </w:p>
-    <w:p>
-      <w:r>
-        <w:t>The core request stays the same, but the amount of softening and explicit reader support increases as the relationship becomes more formal or distant.</w:t>
-      </w:r>
-    </w:p>
-    <w:p>
-      <w:pPr>
-        <w:pStyle w:val="AfterList"/>
-      </w:pPr>
-      <w:r>
-        <w:rPr>
-          <w:b/>
-          <w:bCs/>
-        </w:rPr>
         <w:t>Practice C — Choose the Appropriate Version</w:t>
       </w:r>
     </w:p>
@@ -3552,6 +3557,7 @@
           <w:b/>
           <w:bCs/>
         </w:rPr>
+        <w:lastRenderedPageBreak/>
         <w:t>Transfer reminder:</w:t>
       </w:r>
       <w:r>
@@ -3800,6 +3806,7 @@
       <w:bookmarkStart w:id="43" w:name="self-editing-checklist-f3-1"/>
       <w:bookmarkEnd w:id="42"/>
       <w:r>
+        <w:lastRenderedPageBreak/>
         <w:t>Self-Editing Checklist (F3)</w:t>
       </w:r>
     </w:p>
@@ -4057,6 +4064,7 @@
           <w:b/>
           <w:bCs/>
         </w:rPr>
+        <w:lastRenderedPageBreak/>
         <w:t>Homework Draft</w:t>
       </w:r>
       <w:r>
@@ -4118,9 +4126,9 @@
       <w:pPr>
         <w:pStyle w:val="Heading3"/>
       </w:pPr>
-      <w:bookmarkStart w:id="49" w:name="unit-3-cohesion-logical-flow"/>
-      <w:bookmarkStart w:id="50" w:name="unit-overview-2"/>
-      <w:bookmarkEnd w:id="25"/>
+      <w:bookmarkStart w:id="49" w:name="unit-overview-2"/>
+      <w:bookmarkStart w:id="50" w:name="unit-3-cohesion-logical-flow"/>
+      <w:bookmarkEnd w:id="26"/>
       <w:bookmarkEnd w:id="46"/>
       <w:bookmarkEnd w:id="48"/>
     </w:p>
@@ -4165,6 +4173,7 @@
               <w:pStyle w:val="UnitNumber"/>
             </w:pPr>
             <w:r>
+              <w:lastRenderedPageBreak/>
               <w:t>U3</w:t>
             </w:r>
           </w:p>
@@ -4268,7 +4277,7 @@
         <w:pStyle w:val="Heading3"/>
       </w:pPr>
       <w:bookmarkStart w:id="51" w:name="a.-opening-activation-2"/>
-      <w:bookmarkEnd w:id="50"/>
+      <w:bookmarkEnd w:id="49"/>
       <w:r>
         <w:t>A. Opening &amp; Activation</w:t>
       </w:r>
@@ -4429,6 +4438,7 @@
           <w:i/>
           <w:iCs/>
         </w:rPr>
+        <w:lastRenderedPageBreak/>
         <w:t>“We confirmed the applicant’s details. There is a new procedure. The deadline is Friday.”</w:t>
       </w:r>
     </w:p>
@@ -4702,6 +4712,7 @@
       <w:bookmarkEnd w:id="53"/>
       <w:bookmarkEnd w:id="55"/>
       <w:r>
+        <w:lastRenderedPageBreak/>
         <w:t>C. Language Focus</w:t>
       </w:r>
     </w:p>
@@ -4827,10 +4838,6 @@
         <w:pStyle w:val="AfterList"/>
       </w:pPr>
       <w:r>
-        <w:rPr>
-          <w:b/>
-          <w:bCs/>
-        </w:rPr>
         <w:t>Practice A — Sequence for Logical Flow</w:t>
       </w:r>
     </w:p>
@@ -4916,11 +4923,131 @@
         <w:pStyle w:val="AfterList"/>
       </w:pPr>
       <w:r>
+        <w:t>Examples:</w:t>
+      </w:r>
+    </w:p>
+    <w:p>
+      <w:pPr>
+        <w:pStyle w:val="ListBullet2"/>
+        <w:numPr>
+          <w:ilvl w:val="0"/>
+          <w:numId w:val="56"/>
+        </w:numPr>
+      </w:pPr>
+      <w:r>
+        <w:rPr>
+          <w:i/>
+          <w:iCs/>
+        </w:rPr>
+        <w:t>this issue, these concerns, that step, such changes, the matter</w:t>
+      </w:r>
+    </w:p>
+    <w:p>
+      <w:pPr>
+        <w:pStyle w:val="AfterList"/>
+      </w:pPr>
+      <w:r>
+        <w:t>Practice B — Replace Repetition</w:t>
+      </w:r>
+    </w:p>
+    <w:p>
+      <w:pPr>
+        <w:pStyle w:val="BodyText"/>
+      </w:pPr>
+      <w:r>
+        <w:t>Rewrite each pair of sentences to avoid repeating the same nouns. Use appropriate reference words.</w:t>
+      </w:r>
+    </w:p>
+    <w:p>
+      <w:pPr>
+        <w:pStyle w:val="ListNumber2"/>
+        <w:numPr>
+          <w:ilvl w:val="0"/>
+          <w:numId w:val="57"/>
+        </w:numPr>
+      </w:pPr>
+      <w:r>
+        <w:rPr>
+          <w:i/>
+          <w:iCs/>
+        </w:rPr>
+        <w:t>The document contains errors. The document must be corrected before submission.</w:t>
+      </w:r>
+    </w:p>
+    <w:p>
+      <w:pPr>
+        <w:pStyle w:val="ListNumber2"/>
+        <w:numPr>
+          <w:ilvl w:val="0"/>
+          <w:numId w:val="57"/>
+        </w:numPr>
+      </w:pPr>
+      <w:r>
+        <w:rPr>
+          <w:i/>
+          <w:iCs/>
+        </w:rPr>
+        <w:lastRenderedPageBreak/>
+        <w:t>The applicants raised several questions. The questions will be addressed at the next meeting.</w:t>
+      </w:r>
+    </w:p>
+    <w:p>
+      <w:pPr>
+        <w:pStyle w:val="ListNumber2"/>
+        <w:numPr>
+          <w:ilvl w:val="0"/>
+          <w:numId w:val="57"/>
+        </w:numPr>
+      </w:pPr>
+      <w:r>
+        <w:rPr>
+          <w:i/>
+          <w:iCs/>
+        </w:rPr>
+        <w:t>The office submitted the revision late. The late submission caused delays for the review team.</w:t>
+      </w:r>
+    </w:p>
+    <w:p>
+      <w:pPr>
+        <w:pStyle w:val="ListNumber2"/>
+        <w:numPr>
+          <w:ilvl w:val="0"/>
+          <w:numId w:val="57"/>
+        </w:numPr>
+      </w:pPr>
+      <w:r>
+        <w:rPr>
+          <w:i/>
+          <w:iCs/>
+        </w:rPr>
+        <w:t>The procedure was updated in January. The procedure applies to all agencies from March onwards.</w:t>
+      </w:r>
+    </w:p>
+    <w:p>
+      <w:pPr>
+        <w:pStyle w:val="Heading4"/>
+      </w:pPr>
+      <w:bookmarkStart w:id="63" w:name="thematic-progression-c3"/>
+      <w:bookmarkEnd w:id="62"/>
+      <w:r>
+        <w:t>3. Thematic Progression (C3)</w:t>
+      </w:r>
+    </w:p>
+    <w:p>
+      <w:r>
+        <w:t>Good paragraphs start with known information and move forward to new information.</w:t>
+      </w:r>
+    </w:p>
+    <w:p>
+      <w:pPr>
+        <w:pStyle w:val="BodyText"/>
+      </w:pPr>
+      <w:r>
         <w:rPr>
           <w:b/>
           <w:bCs/>
         </w:rPr>
-        <w:t>Examples:</w:t>
+        <w:t>Pattern:</w:t>
       </w:r>
     </w:p>
     <w:p>
@@ -4928,7 +5055,52 @@
         <w:pStyle w:val="ListBullet2"/>
         <w:numPr>
           <w:ilvl w:val="0"/>
-          <w:numId w:val="56"/>
+          <w:numId w:val="58"/>
+        </w:numPr>
+      </w:pPr>
+      <w:r>
+        <w:t>Sentence 1: Introduce the topic</w:t>
+      </w:r>
+    </w:p>
+    <w:p>
+      <w:pPr>
+        <w:pStyle w:val="ListBullet2"/>
+        <w:numPr>
+          <w:ilvl w:val="0"/>
+          <w:numId w:val="58"/>
+        </w:numPr>
+      </w:pPr>
+      <w:r>
+        <w:t>Sentence 2: Add detail or explanation</w:t>
+      </w:r>
+    </w:p>
+    <w:p>
+      <w:pPr>
+        <w:pStyle w:val="ListBullet2"/>
+        <w:numPr>
+          <w:ilvl w:val="0"/>
+          <w:numId w:val="58"/>
+        </w:numPr>
+      </w:pPr>
+      <w:r>
+        <w:t>Sentence 3: Show the implication or next step</w:t>
+      </w:r>
+    </w:p>
+    <w:p>
+      <w:r>
+        <w:rPr>
+          <w:b/>
+          <w:bCs/>
+        </w:rPr>
+        <w:t>Worked example:</w:t>
+      </w:r>
+    </w:p>
+    <w:p>
+      <w:pPr>
+        <w:pStyle w:val="ListBullet2"/>
+        <w:numPr>
+          <w:ilvl w:val="0"/>
+          <w:numId w:val="59"/>
         </w:numPr>
       </w:pPr>
       <w:r>
@@ -4936,35 +5108,15 @@
           <w:i/>
           <w:iCs/>
         </w:rPr>
-        <w:t>this issue, these concerns, that step, such changes, the matter</w:t>
-      </w:r>
-    </w:p>
-    <w:p>
-      <w:pPr>
-        <w:pStyle w:val="AfterList"/>
-      </w:pPr>
-      <w:r>
-        <w:rPr>
-          <w:b/>
-          <w:bCs/>
-        </w:rPr>
-        <w:t>Practice B — Replace Repetition</w:t>
-      </w:r>
-    </w:p>
-    <w:p>
-      <w:pPr>
-        <w:pStyle w:val="BodyText"/>
-      </w:pPr>
-      <w:r>
-        <w:t>Rewrite each pair of sentences to avoid repeating the same nouns. Use appropriate reference words.</w:t>
-      </w:r>
-    </w:p>
-    <w:p>
-      <w:pPr>
-        <w:pStyle w:val="ListNumber2"/>
-        <w:numPr>
-          <w:ilvl w:val="0"/>
-          <w:numId w:val="57"/>
+        <w:t>The coordination meeting identified three problems with the new submission process.</w:t>
+      </w:r>
+    </w:p>
+    <w:p>
+      <w:pPr>
+        <w:pStyle w:val="ListBullet2"/>
+        <w:numPr>
+          <w:ilvl w:val="0"/>
+          <w:numId w:val="59"/>
         </w:numPr>
       </w:pPr>
       <w:r>
@@ -4972,15 +5124,15 @@
           <w:i/>
           <w:iCs/>
         </w:rPr>
-        <w:t>The document contains errors. The document must be corrected before submission.</w:t>
-      </w:r>
-    </w:p>
-    <w:p>
-      <w:pPr>
-        <w:pStyle w:val="ListNumber2"/>
-        <w:numPr>
-          <w:ilvl w:val="0"/>
-          <w:numId w:val="57"/>
+        <w:t>These problems mainly concerned terminology, deadline confusion, and inconsistent file naming.</w:t>
+      </w:r>
+    </w:p>
+    <w:p>
+      <w:pPr>
+        <w:pStyle w:val="ListBullet2"/>
+        <w:numPr>
+          <w:ilvl w:val="0"/>
+          <w:numId w:val="59"/>
         </w:numPr>
       </w:pPr>
       <w:r>
@@ -4988,158 +5140,6 @@
           <w:i/>
           <w:iCs/>
         </w:rPr>
-        <w:t>The applicants raised several questions. The questions will be addressed at the next meeting.</w:t>
-      </w:r>
-    </w:p>
-    <w:p>
-      <w:pPr>
-        <w:pStyle w:val="ListNumber2"/>
-        <w:numPr>
-          <w:ilvl w:val="0"/>
-          <w:numId w:val="57"/>
-        </w:numPr>
-      </w:pPr>
-      <w:r>
-        <w:rPr>
-          <w:i/>
-          <w:iCs/>
-        </w:rPr>
-        <w:t>The office submitted the revision late. The late submission caused delays for the review team.</w:t>
-      </w:r>
-    </w:p>
-    <w:p>
-      <w:pPr>
-        <w:pStyle w:val="ListNumber2"/>
-        <w:numPr>
-          <w:ilvl w:val="0"/>
-          <w:numId w:val="57"/>
-        </w:numPr>
-      </w:pPr>
-      <w:r>
-        <w:rPr>
-          <w:i/>
-          <w:iCs/>
-        </w:rPr>
-        <w:t>The procedure was updated in January. The procedure applies to all agencies from March onwards.</w:t>
-      </w:r>
-    </w:p>
-    <w:p>
-      <w:pPr>
-        <w:pStyle w:val="Heading4"/>
-      </w:pPr>
-      <w:bookmarkStart w:id="63" w:name="thematic-progression-c3"/>
-      <w:bookmarkEnd w:id="62"/>
-      <w:r>
-        <w:t>3. Thematic Progression (C3)</w:t>
-      </w:r>
-    </w:p>
-    <w:p>
-      <w:r>
-        <w:t>Good paragraphs start with known information and move forward to new information.</w:t>
-      </w:r>
-    </w:p>
-    <w:p>
-      <w:pPr>
-        <w:pStyle w:val="BodyText"/>
-      </w:pPr>
-      <w:r>
-        <w:rPr>
-          <w:b/>
-          <w:bCs/>
-        </w:rPr>
-        <w:t>Pattern:</w:t>
-      </w:r>
-    </w:p>
-    <w:p>
-      <w:pPr>
-        <w:pStyle w:val="ListBullet2"/>
-        <w:numPr>
-          <w:ilvl w:val="0"/>
-          <w:numId w:val="58"/>
-        </w:numPr>
-      </w:pPr>
-      <w:r>
-        <w:t>Sentence 1: Introduce the topic</w:t>
-      </w:r>
-    </w:p>
-    <w:p>
-      <w:pPr>
-        <w:pStyle w:val="ListBullet2"/>
-        <w:numPr>
-          <w:ilvl w:val="0"/>
-          <w:numId w:val="58"/>
-        </w:numPr>
-      </w:pPr>
-      <w:r>
-        <w:t>Sentence 2: Add detail or explanation</w:t>
-      </w:r>
-    </w:p>
-    <w:p>
-      <w:pPr>
-        <w:pStyle w:val="ListBullet2"/>
-        <w:numPr>
-          <w:ilvl w:val="0"/>
-          <w:numId w:val="58"/>
-        </w:numPr>
-      </w:pPr>
-      <w:r>
-        <w:t>Sentence 3: Show the implication or next step</w:t>
-      </w:r>
-    </w:p>
-    <w:p>
-      <w:r>
-        <w:rPr>
-          <w:b/>
-          <w:bCs/>
-        </w:rPr>
-        <w:t>Worked example:</w:t>
-      </w:r>
-    </w:p>
-    <w:p>
-      <w:pPr>
-        <w:pStyle w:val="ListBullet2"/>
-        <w:numPr>
-          <w:ilvl w:val="0"/>
-          <w:numId w:val="59"/>
-        </w:numPr>
-      </w:pPr>
-      <w:r>
-        <w:rPr>
-          <w:i/>
-          <w:iCs/>
-        </w:rPr>
-        <w:t>The coordination meeting identified three problems with the new submission process.</w:t>
-      </w:r>
-    </w:p>
-    <w:p>
-      <w:pPr>
-        <w:pStyle w:val="ListBullet2"/>
-        <w:numPr>
-          <w:ilvl w:val="0"/>
-          <w:numId w:val="59"/>
-        </w:numPr>
-      </w:pPr>
-      <w:r>
-        <w:rPr>
-          <w:i/>
-          <w:iCs/>
-        </w:rPr>
-        <w:t>These problems mainly concerned terminology, deadline confusion, and inconsistent file naming.</w:t>
-      </w:r>
-    </w:p>
-    <w:p>
-      <w:pPr>
-        <w:pStyle w:val="ListBullet2"/>
-        <w:numPr>
-          <w:ilvl w:val="0"/>
-          <w:numId w:val="59"/>
-        </w:numPr>
-      </w:pPr>
-      <w:r>
-        <w:rPr>
-          <w:i/>
-          <w:iCs/>
-        </w:rPr>
         <w:t>As a result, the team agreed to issue a revised guidance note before the next reporting cycle.</w:t>
       </w:r>
     </w:p>
@@ -5153,10 +5153,6 @@
         <w:pStyle w:val="AfterList"/>
       </w:pPr>
       <w:r>
-        <w:rPr>
-          <w:b/>
-          <w:bCs/>
-        </w:rPr>
         <w:t>Practice C — Add Logical Connectors</w:t>
       </w:r>
     </w:p>
@@ -5254,6 +5250,7 @@
     </w:p>
     <w:p>
       <w:r>
+        <w:lastRenderedPageBreak/>
         <w:t xml:space="preserve">Rewrite the original (disjointed) model text as </w:t>
       </w:r>
       <w:r>
@@ -5552,6 +5549,7 @@
         </w:numPr>
       </w:pPr>
       <w:r>
+        <w:lastRenderedPageBreak/>
         <w:t>A recurring delay in applicant processing has been traced to an inconsistency between two versions of a guidance document currently in use across different teams. Write a paragraph explaining the situation and its impact for inclusion in an internal briefing note.</w:t>
       </w:r>
     </w:p>
@@ -5801,13 +5799,11 @@
           <w:b/>
           <w:bCs/>
         </w:rPr>
+        <w:lastRenderedPageBreak/>
         <w:t>Write Your Revised Version</w:t>
       </w:r>
       <w:r>
-        <w:t xml:space="preserve"> </w:t>
-      </w:r>
-      <w:r>
-        <w:t>{{PH-2: U03-G1-editing-rewrite}}</w:t>
+        <w:t xml:space="preserve"> {{PH-2: U03-G1-editing-rewrite}}</w:t>
       </w:r>
     </w:p>
     <w:p>
@@ -5954,7 +5950,7 @@
       <w:r>
         <w:t>Write a short guide (six to eight sentences) for a colleague who struggles with paragraph organisation. Explain thematic progression — what it is, why it matters, and how to apply it — using two original before-and-after examples.</w:t>
       </w:r>
-      <w:bookmarkEnd w:id="49"/>
+      <w:bookmarkEnd w:id="50"/>
       <w:bookmarkEnd w:id="74"/>
       <w:bookmarkEnd w:id="76"/>
     </w:p>
@@ -8236,13 +8232,13 @@
     <w:uiPriority w:val="9"/>
     <w:unhideWhenUsed/>
     <w:qFormat/>
-    <w:rsid w:val="009F6FA0"/>
+    <w:rsid w:val="0048727C"/>
     <w:pPr>
       <w:pBdr>
         <w:left w:val="single" w:sz="48" w:space="4" w:color="E36C0A" w:themeColor="accent6" w:themeShade="BF"/>
       </w:pBdr>
       <w:shd w:val="clear" w:color="auto" w:fill="DAEEF3" w:themeFill="accent5" w:themeFillTint="33"/>
-      <w:spacing w:line="240" w:lineRule="auto"/>
+      <w:spacing w:before="480" w:line="240" w:lineRule="auto"/>
       <w:ind w:left="227"/>
       <w:outlineLvl w:val="2"/>
     </w:pPr>
@@ -8261,12 +8257,12 @@
     <w:uiPriority w:val="9"/>
     <w:unhideWhenUsed/>
     <w:qFormat/>
-    <w:rsid w:val="0092015E"/>
+    <w:rsid w:val="0048727C"/>
     <w:pPr>
       <w:pBdr>
         <w:bottom w:val="single" w:sz="12" w:space="1" w:color="9BBB59" w:themeColor="accent3"/>
       </w:pBdr>
-      <w:spacing w:before="240" w:after="160" w:line="240" w:lineRule="auto"/>
+      <w:spacing w:before="480" w:after="160" w:line="240" w:lineRule="auto"/>
       <w:outlineLvl w:val="3"/>
     </w:pPr>
     <w:rPr>
@@ -8388,7 +8384,6 @@
   <w:style w:type="character" w:default="1" w:styleId="DefaultParagraphFont">
     <w:name w:val="Default Paragraph Font"/>
     <w:uiPriority w:val="1"/>
-    <w:semiHidden/>
     <w:unhideWhenUsed/>
   </w:style>
   <w:style w:type="table" w:default="1" w:styleId="TableNormal">
@@ -8512,7 +8507,7 @@
     <w:basedOn w:val="DefaultParagraphFont"/>
     <w:link w:val="Heading3"/>
     <w:uiPriority w:val="9"/>
-    <w:rsid w:val="009F6FA0"/>
+    <w:rsid w:val="0048727C"/>
     <w:rPr>
       <w:rFonts w:ascii="Roboto Condensed" w:hAnsi="Roboto Condensed"/>
       <w:color w:val="984806" w:themeColor="accent6" w:themeShade="80"/>
@@ -8902,7 +8897,7 @@
     <w:basedOn w:val="DefaultParagraphFont"/>
     <w:link w:val="Heading4"/>
     <w:uiPriority w:val="9"/>
-    <w:rsid w:val="0092015E"/>
+    <w:rsid w:val="0048727C"/>
     <w:rPr>
       <w:rFonts w:ascii="Roboto Condensed Medium" w:hAnsi="Roboto Condensed Medium"/>
       <w:sz w:val="28"/>
@@ -19208,10 +19203,10 @@
     <w:basedOn w:val="Normal"/>
     <w:uiPriority w:val="99"/>
     <w:unhideWhenUsed/>
-    <w:rsid w:val="00760E23"/>
+    <w:rsid w:val="0048727C"/>
     <w:pPr>
       <w:pBdr>
-        <w:left w:val="single" w:sz="36" w:space="0" w:color="4F81BD" w:themeColor="accent1"/>
+        <w:left w:val="single" w:sz="36" w:space="4" w:color="4F81BD" w:themeColor="accent1"/>
       </w:pBdr>
       <w:shd w:val="clear" w:color="auto" w:fill="D9D9D9" w:themeFill="background1" w:themeFillShade="D9"/>
       <w:spacing w:before="240" w:after="240"/>
@@ -19278,7 +19273,7 @@
     <w:name w:val="Block Text Good"/>
     <w:basedOn w:val="BlockText"/>
     <w:qFormat/>
-    <w:rsid w:val="00760E23"/>
+    <w:rsid w:val="0048727C"/>
     <w:pPr>
       <w:pBdr>
         <w:top w:val="single" w:sz="8" w:space="1" w:color="9BBB59" w:themeColor="accent3"/>
@@ -19286,6 +19281,7 @@
         <w:bottom w:val="single" w:sz="8" w:space="1" w:color="9BBB59" w:themeColor="accent3"/>
         <w:right w:val="single" w:sz="8" w:space="2" w:color="9BBB59" w:themeColor="accent3"/>
       </w:pBdr>
+      <w:spacing w:after="360"/>
       <w:ind w:left="850" w:right="850"/>
     </w:pPr>
     <w:rPr>
@@ -19298,7 +19294,7 @@
     <w:basedOn w:val="Normal"/>
     <w:next w:val="Normal"/>
     <w:qFormat/>
-    <w:rsid w:val="00760E23"/>
+    <w:rsid w:val="0048727C"/>
     <w:pPr>
       <w:pBdr>
         <w:top w:val="single" w:sz="8" w:space="1" w:color="C0504D" w:themeColor="accent2"/>
@@ -19307,7 +19303,7 @@
         <w:right w:val="single" w:sz="8" w:space="2" w:color="C0504D" w:themeColor="accent2"/>
       </w:pBdr>
       <w:shd w:val="clear" w:color="auto" w:fill="D9D9D9" w:themeFill="background1" w:themeFillShade="D9"/>
-      <w:spacing w:before="240" w:after="240"/>
+      <w:spacing w:before="240" w:after="360"/>
       <w:ind w:left="850" w:right="850"/>
     </w:pPr>
     <w:rPr>
@@ -19416,9 +19412,9 @@
     <w:basedOn w:val="Normal"/>
     <w:next w:val="Normal"/>
     <w:qFormat/>
-    <w:rsid w:val="00B013B7"/>
+    <w:rsid w:val="0048727C"/>
     <w:pPr>
-      <w:spacing w:before="200"/>
+      <w:spacing w:before="320"/>
     </w:pPr>
     <w:rPr>
       <w:lang w:eastAsia="ja-JP"/>

</xml_diff>